<commit_message>
docs(thesis): update de cuong (thesis outline) docx
</commit_message>
<xml_diff>
--- a/De cuong LVThS - Le Dang Dung.docx
+++ b/De cuong LVThS - Le Dang Dung.docx
@@ -147,7 +147,7 @@
                     </wp:anchor>
                   </w:drawing>
                 </mc:Choice>
-                <mc:Fallback xmlns:w16cei="http://schemas.microsoft.com/office/word/2026/wordml/cei" xmlns:sl="http://schemas.openxmlformats.org/schemaLibrary/2006/main" xmlns:a="http://schemas.openxmlformats.org/drawingml/2006/main" xmlns:pic="http://schemas.openxmlformats.org/drawingml/2006/picture" xmlns:c="http://schemas.openxmlformats.org/drawingml/2006/chart" xmlns:lc="http://schemas.openxmlformats.org/drawingml/2006/lockedCanvas" xmlns:dgm="http://schemas.openxmlformats.org/drawingml/2006/diagram" xmlns="http://schemas.microsoft.com/office/tasks/2019/documenttasks" xmlns:cr="http://schemas.microsoft.com/office/comments/2020/reactions">
+                <mc:Fallback xmlns:cr="http://schemas.microsoft.com/office/comments/2020/reactions" xmlns="http://schemas.microsoft.com/office/tasks/2019/documenttasks" xmlns:dgm="http://schemas.openxmlformats.org/drawingml/2006/diagram" xmlns:lc="http://schemas.openxmlformats.org/drawingml/2006/lockedCanvas" xmlns:c="http://schemas.openxmlformats.org/drawingml/2006/chart" xmlns:pic="http://schemas.openxmlformats.org/drawingml/2006/picture" xmlns:a="http://schemas.openxmlformats.org/drawingml/2006/main" xmlns:sl="http://schemas.openxmlformats.org/schemaLibrary/2006/main" xmlns:w16cei="http://schemas.microsoft.com/office/word/2026/wordml/cei">
                   <w:drawing>
                     <wp:anchor distT="0" distB="0" distL="0" distR="0" simplePos="0" relativeHeight="0" behindDoc="0" locked="0" layoutInCell="1" hidden="0" allowOverlap="1" wp14:anchorId="3815AE3A" wp14:editId="7777777">
                       <wp:simplePos x="0" y="0"/>
@@ -288,7 +288,7 @@
                     </wp:anchor>
                   </w:drawing>
                 </mc:Choice>
-                <mc:Fallback xmlns:w16cei="http://schemas.microsoft.com/office/word/2026/wordml/cei" xmlns:sl="http://schemas.openxmlformats.org/schemaLibrary/2006/main" xmlns:a="http://schemas.openxmlformats.org/drawingml/2006/main" xmlns:pic="http://schemas.openxmlformats.org/drawingml/2006/picture" xmlns:c="http://schemas.openxmlformats.org/drawingml/2006/chart" xmlns:lc="http://schemas.openxmlformats.org/drawingml/2006/lockedCanvas" xmlns:dgm="http://schemas.openxmlformats.org/drawingml/2006/diagram" xmlns="http://schemas.microsoft.com/office/tasks/2019/documenttasks" xmlns:cr="http://schemas.microsoft.com/office/comments/2020/reactions">
+                <mc:Fallback xmlns:cr="http://schemas.microsoft.com/office/comments/2020/reactions" xmlns="http://schemas.microsoft.com/office/tasks/2019/documenttasks" xmlns:dgm="http://schemas.openxmlformats.org/drawingml/2006/diagram" xmlns:lc="http://schemas.openxmlformats.org/drawingml/2006/lockedCanvas" xmlns:c="http://schemas.openxmlformats.org/drawingml/2006/chart" xmlns:pic="http://schemas.openxmlformats.org/drawingml/2006/picture" xmlns:a="http://schemas.openxmlformats.org/drawingml/2006/main" xmlns:sl="http://schemas.openxmlformats.org/schemaLibrary/2006/main" xmlns:w16cei="http://schemas.microsoft.com/office/word/2026/wordml/cei">
                   <w:drawing>
                     <wp:anchor distT="0" distB="0" distL="0" distR="0" simplePos="0" relativeHeight="0" behindDoc="0" locked="0" layoutInCell="1" hidden="0" allowOverlap="1" wp14:anchorId="7092D85D" wp14:editId="7777777">
                       <wp:simplePos x="0" y="0"/>
@@ -384,7 +384,7 @@
                     </wp:anchor>
                   </w:drawing>
                 </mc:Choice>
-                <mc:Fallback xmlns:w16cei="http://schemas.microsoft.com/office/word/2026/wordml/cei" xmlns:sl="http://schemas.openxmlformats.org/schemaLibrary/2006/main" xmlns:a="http://schemas.openxmlformats.org/drawingml/2006/main" xmlns:pic="http://schemas.openxmlformats.org/drawingml/2006/picture" xmlns:c="http://schemas.openxmlformats.org/drawingml/2006/chart" xmlns:lc="http://schemas.openxmlformats.org/drawingml/2006/lockedCanvas" xmlns:dgm="http://schemas.openxmlformats.org/drawingml/2006/diagram" xmlns="http://schemas.microsoft.com/office/tasks/2019/documenttasks" xmlns:cr="http://schemas.microsoft.com/office/comments/2020/reactions">
+                <mc:Fallback xmlns:cr="http://schemas.microsoft.com/office/comments/2020/reactions" xmlns="http://schemas.microsoft.com/office/tasks/2019/documenttasks" xmlns:dgm="http://schemas.openxmlformats.org/drawingml/2006/diagram" xmlns:lc="http://schemas.openxmlformats.org/drawingml/2006/lockedCanvas" xmlns:c="http://schemas.openxmlformats.org/drawingml/2006/chart" xmlns:pic="http://schemas.openxmlformats.org/drawingml/2006/picture" xmlns:a="http://schemas.openxmlformats.org/drawingml/2006/main" xmlns:sl="http://schemas.openxmlformats.org/schemaLibrary/2006/main" xmlns:w16cei="http://schemas.microsoft.com/office/word/2026/wordml/cei">
                   <w:drawing>
                     <wp:anchor distT="0" distB="0" distL="114300" distR="114300" simplePos="0" relativeHeight="0" behindDoc="0" locked="0" layoutInCell="1" hidden="0" allowOverlap="1" wp14:anchorId="6684A9FF" wp14:editId="7777777">
                       <wp:simplePos x="0" y="0"/>
@@ -496,7 +496,7 @@
               </wp:anchor>
             </w:drawing>
           </mc:Choice>
-          <mc:Fallback xmlns:w16cei="http://schemas.microsoft.com/office/word/2026/wordml/cei" xmlns:sl="http://schemas.openxmlformats.org/schemaLibrary/2006/main" xmlns:a="http://schemas.openxmlformats.org/drawingml/2006/main" xmlns:pic="http://schemas.openxmlformats.org/drawingml/2006/picture" xmlns:c="http://schemas.openxmlformats.org/drawingml/2006/chart" xmlns:lc="http://schemas.openxmlformats.org/drawingml/2006/lockedCanvas" xmlns:dgm="http://schemas.openxmlformats.org/drawingml/2006/diagram" xmlns="http://schemas.microsoft.com/office/tasks/2019/documenttasks" xmlns:cr="http://schemas.microsoft.com/office/comments/2020/reactions">
+          <mc:Fallback xmlns:cr="http://schemas.microsoft.com/office/comments/2020/reactions" xmlns="http://schemas.microsoft.com/office/tasks/2019/documenttasks" xmlns:dgm="http://schemas.openxmlformats.org/drawingml/2006/diagram" xmlns:lc="http://schemas.openxmlformats.org/drawingml/2006/lockedCanvas" xmlns:c="http://schemas.openxmlformats.org/drawingml/2006/chart" xmlns:pic="http://schemas.openxmlformats.org/drawingml/2006/picture" xmlns:a="http://schemas.openxmlformats.org/drawingml/2006/main" xmlns:sl="http://schemas.openxmlformats.org/schemaLibrary/2006/main" xmlns:w16cei="http://schemas.microsoft.com/office/word/2026/wordml/cei">
             <w:drawing>
               <wp:anchor distT="0" distB="0" distL="114300" distR="114300" simplePos="0" relativeHeight="0" behindDoc="0" locked="0" layoutInCell="1" hidden="0" allowOverlap="1" wp14:anchorId="1FEAB243" wp14:editId="7777777">
                 <wp:simplePos x="0" y="0"/>
@@ -3756,7 +3756,13 @@
               <w:pStyle w:val="Paragraph"/>
             </w:pPr>
             <w:r>
-              <w:t>Đề tài sử dụng Clang Static Analyzer kết hợp tree-sitter (xây dựng cây cú pháp trừu tượng không cần biên dịch) làm nền phân tích tĩnh; Valgrind Memcheck [2], [3], AddressSanitizer và LeakSanitizer [4], [5] làm nền phân tích động. Hai nhóm công cụ này được đóng gói thành hai dịch vụ độc lập trên nền NestJS, giao tiếp với thành phần điều phối qua Model Context Protocol (MCP) [14] trên nền HTTP. Thành phần điều phối và vòng lặp gọi công cụ được phát triển bằng TypeScript trên nền Node.js; toàn bộ hệ thống được đóng gói và triển khai bằng Docker để bảo đảm tính nhất quán giữa môi trường phát triển và thực nghiệm.</w:t>
+              <w:t>Đề tài sử dụng Clang Static Analyzer kết hợp tree-sitter (xây dựng cây cú pháp trừu tượng không cần biên dịch) làm nền phân tích tĩnh; Valgrind Memcheck [2], [3], AddressSanitizer và LeakSanitizer [4], [5] làm nền phân tích động. Hai nhóm công cụ này được đóng gói thành hai dịch vụ độc lập trên nền NestJS, giao tiếp với thành phần điều phối qua Model Context Protocol (MCP) [14] trên nền HTTP. Thành phần điều phối và vòng lặp gọi công cụ được phát triển bằng TypeScript trên nền Node.js</w:t>
+            </w:r>
+            <w:r>
+              <w:t>,</w:t>
+            </w:r>
+            <w:r>
+              <w:t xml:space="preserve"> toàn bộ hệ thống được đóng gói và triển khai bằng Docker để bảo đảm tính nhất quán giữa môi trường phát triển và thực nghiệm.</w:t>
             </w:r>
           </w:p>
           <w:p>
@@ -3780,25 +3786,43 @@
               <w:pStyle w:val="Paragraph"/>
             </w:pPr>
             <w:r>
-              <w:t>Quy trình điều tra gồm năm giai đoạn: (1) discovery quét ứng viên cấp phát bộ nhớ một cách tất định; (2) static enrichment bổ sung bằng chứng tĩnh</w:t>
+              <w:t>Quy trình điều tra gồm năm giai đoạn: (1) discovery quét ứng viên cấp phát bộ nhớ một cách tất định</w:t>
             </w:r>
             <w:r>
               <w:t>,</w:t>
             </w:r>
             <w:r>
-              <w:t xml:space="preserve"> cặp cấp phát/giải phóng, đường rò khả thi cho từng ứng viên; (3) investigation, trong đó các thành phần tĩnh thu thập bằng chứng song song trong khi thành phần động biên dịch và chạy LeakSanitizer theo một quy trình tất định; (4) judging theo mô hình hybrid, trong đó tầng phán xử heuristic áp dụng cho mọi ứng viên còn LLM</w:t>
+              <w:t xml:space="preserve"> (2) static enrichment bổ sung bằng chứng tĩnh</w:t>
             </w:r>
             <w:r>
               <w:t>,</w:t>
             </w:r>
             <w:r>
+              <w:t xml:space="preserve"> cặp cấp phát/giải phóng, đường rò khả thi cho từng ứng viên</w:t>
+            </w:r>
+            <w:r>
+              <w:t>,</w:t>
+            </w:r>
+            <w:r>
+              <w:t xml:space="preserve"> (3) investigation, trong đó các thành phần tĩnh thu thập bằng chứng song song trong khi thành phần động biên dịch và chạy LeakSanitizer theo một quy trình tất định</w:t>
+            </w:r>
+            <w:r>
+              <w:t xml:space="preserve">, </w:t>
+            </w:r>
+            <w:r>
+              <w:t>(4) judging theo mô hình hybrid, trong đó tầng phán xử heuristic áp dụng cho mọi ứng viên còn LLM</w:t>
+            </w:r>
+            <w:r>
+              <w:t>,</w:t>
+            </w:r>
+            <w:r>
               <w:t xml:space="preserve"> đơn lẻ hoặc theo cơ chế đồng thuận nhiều mẫu</w:t>
             </w:r>
             <w:r>
               <w:t>,</w:t>
             </w:r>
             <w:r>
-              <w:t xml:space="preserve"> chỉ can thiệp với các trường hợp ranh giới (borderline); và (5) reporting, sinh báo cáo dưới nhiều định dạng.</w:t>
+              <w:t xml:space="preserve"> chỉ can thiệp với các trường hợp ranh giới (borderline) và (5) reporting, sinh báo cáo dưới nhiều định dạng.</w:t>
             </w:r>
           </w:p>
           <w:p>
@@ -3806,7 +3830,13 @@
               <w:pStyle w:val="Paragraph"/>
             </w:pPr>
             <w:r>
-              <w:t>Toàn bộ bằng chứng thu thập được chuẩn hoá vào một mô hình dữ liệu thống nhất, gồm vị trí cấp phát nghi vấn, tập bằng chứng từ các công cụ phân tích tĩnh và động, và kết luận cuối cùng kèm mức độ tin cậy, giải thích nguyên nhân gốc và đề xuất bản vá. Kiến trúc này cho phép hệ thống hợp nhất nhiều nguồn bằng chứng vào một quy trình suy luận thống nhất, đồng thời tách biệt phần thực thi tất định (thu thập bằng chứng) khỏi phần suy luận của LLM (điều phối và phán xử ranh giới) — cơ sở cho khả năng tái lập được trình bày ở phần Phương pháp nghiên cứu.</w:t>
+              <w:t>Toàn bộ bằng chứng thu thập được chuẩn hoá vào một mô hình dữ liệu thống nhất, gồm vị trí cấp phát nghi vấn, tập bằng chứng từ các công cụ phân tích tĩnh và động, và kết luận cuối cùng kèm mức độ tin cậy, giải thích nguyên nhân gốc và đề xuất bản vá. Kiến trúc này cho phép hệ thống hợp nhất nhiều nguồn bằng chứng vào một quy trình suy luận thống nhất, đồng thời tách biệt phần thực thi tất định (thu thập bằng chứng) khỏi phần suy luận của LLM (điều phối và phán xử ranh giới</w:t>
+            </w:r>
+            <w:r>
+              <w:t>),</w:t>
+            </w:r>
+            <w:r>
+              <w:t xml:space="preserve"> cơ sở cho khả năng tái lập được trình bày ở phần Phương pháp nghiên cứu.</w:t>
             </w:r>
           </w:p>
           <w:p>

</xml_diff>